<commit_message>
Version 0.0.38 : modèles Word et OpenDocument en A4
- Les modèles Word et OpenDocument de tous les formats passent du format
  Letter américain à l'A4, avec des marges de 2,5 cm, comme le PDF.
- Le format vanilla ne fait plus que reporter ses marges dans le modèle
  Word, dont la feuille est déjà en A4.

Co-Authored-By: Claude Opus 5.5 <noreply@anthropic.com>
</commit_message>
<xml_diff>
--- a/src-tauri/resources/reference.docx
+++ b/src-tauri/resources/reference.docx
@@ -382,7 +382,10 @@
 </w:t>
       </w:r>
     </w:p>
-    <w:sectPr/>
+    <w:sectPr>
+      <w:pgSz w:w="11906" w:h="16838"/>
+      <w:pgMar w:top="1417" w:right="1417" w:bottom="1417" w:left="1417" w:header="708" w:footer="708" w:gutter="0"/>
+    </w:sectPr>
   </w:body>
 </w:document>
 </file>

</xml_diff>